<commit_message>
v5.22.0: manual por perfil e muito mais detalhado (cada tela e botão da D.E, RTS e gestão)
Co-Authored-By: Claude Opus 5.5 <noreply@anthropic.com>
Claude-Session: https://claude.ai/code/session_019C5pL3tAQSfZCPA82KGQYq
</commit_message>
<xml_diff>
--- a/docs/manual/MINC_ServiceHub_Roteiro-de-treinamento.docx
+++ b/docs/manual/MINC_ServiceHub_Roteiro-de-treinamento.docx
@@ -139,7 +139,7 @@
           <w:i w:val="0"/>
           <w:sz w:val="20"/>
         </w:rPr>
-        <w:t>O que é o MINC ServiceHub e o fluxo: peritagem (D.E) → estrutura → documentos → checklist; RTS → aprovação → comparativo.</w:t>
+        <w:t>O que é o MINC ServiceHub e o fluxo: peritagem (D.E) → estrutura → documento → checklist; RTS → aprovação → comparativo.</w:t>
       </w:r>
     </w:p>
     <w:p>
@@ -199,7 +199,7 @@
           <w:i w:val="0"/>
           <w:sz w:val="20"/>
         </w:rPr>
-        <w:t>Sincronização, sino, lupa e menu do usuário.</w:t>
+        <w:t>Sincronização, sino, lupa, tema e menu do usuário (Ajuda e manual).</w:t>
       </w:r>
     </w:p>
     <w:p>
@@ -229,7 +229,7 @@
           <w:i w:val="0"/>
           <w:sz w:val="20"/>
         </w:rPr>
-        <w:t>Em dupla: abrir um processo de treino (cliente “TREINAMENTO”), com 3 componentes.</w:t>
+        <w:t>Em dupla: abrir um processo de treino (cliente “TREINAMENTO”) e passar por todas as etapas.</w:t>
       </w:r>
     </w:p>
     <w:p>
@@ -244,7 +244,7 @@
           <w:i w:val="0"/>
           <w:sz w:val="20"/>
         </w:rPr>
-        <w:t>Uma matéria-prima da lista com busca %, um item sem cadastro com ficha, um serviço externo e fotos.</w:t>
+        <w:t>3 componentes: uma matéria-prima da lista com busca %, um item sem cadastro com ficha, um serviço externo, atividades de dois setores e fotos.</w:t>
       </w:r>
     </w:p>
     <w:p>
@@ -259,7 +259,7 @@
           <w:i w:val="0"/>
           <w:sz w:val="20"/>
         </w:rPr>
-        <w:t>Gerar o documento de execução e o checklist R-MINC-078-IRS-PT.</w:t>
+        <w:t>Testes e embalagem padrão; gerar e arquivar o documento e o checklist R-MINC-078-IRS-PT; exportar o Excel da estrutura.</w:t>
       </w:r>
     </w:p>
     <w:p>
@@ -289,7 +289,7 @@
           <w:i w:val="0"/>
           <w:sz w:val="20"/>
         </w:rPr>
-        <w:t>Ligar o modo avião, editar o processo, ver a faixa amarela e os pendentes; voltar a internet e conferir o envio.</w:t>
+        <w:t>Modo avião, editar o processo, ver a faixa amarela e os pendentes; voltar a internet e conferir o envio.</w:t>
       </w:r>
     </w:p>
     <w:p>
@@ -319,7 +319,7 @@
           <w:i w:val="0"/>
           <w:sz w:val="20"/>
         </w:rPr>
-        <w:t>Criar um RTS de treino, vincular ao processo, ver o comparativo.</w:t>
+        <w:t>Criar um RTS de treino, vincular ao processo e ver o comparativo.</w:t>
       </w:r>
     </w:p>
     <w:p>
@@ -394,7 +394,7 @@
           <w:i w:val="0"/>
           <w:sz w:val="20"/>
         </w:rPr>
-        <w:t>Dúvidas, onde fica a ajuda (seu nome &gt; Ajuda e manual) e combinar a semana de uso acompanhado.</w:t>
+        <w:t>Dúvidas e combinar a semana de uso acompanhado.</w:t>
       </w:r>
     </w:p>
     <w:p>
@@ -409,7 +409,7 @@
           <w:i w:val="0"/>
           <w:sz w:val="20"/>
         </w:rPr>
-        <w:t>Excluir os processos e RTS de treino (gestor/administrador).</w:t>
+        <w:t>Excluir os processos e RTS de treino.</w:t>
       </w:r>
     </w:p>
     <w:p>

</xml_diff>